<commit_message>
fixed nav bar hopefully
</commit_message>
<xml_diff>
--- a/CV/Spenceley_Resume2026.docx
+++ b/CV/Spenceley_Resume2026.docx
@@ -93,27 +93,7 @@
             <w:szCs w:val="19"/>
             <w:u w:val="single"/>
           </w:rPr>
-          <w:t>Por</w:t>
-        </w:r>
-        <w:r>
-          <w:rPr>
-            <w:rFonts w:ascii="Calibri" w:eastAsia="Calibri" w:hAnsi="Calibri" w:cs="Calibri"/>
-            <w:color w:val="2F5D62"/>
-            <w:sz w:val="19"/>
-            <w:szCs w:val="19"/>
-            <w:u w:val="single"/>
-          </w:rPr>
-          <w:t>t</w:t>
-        </w:r>
-        <w:r>
-          <w:rPr>
-            <w:rFonts w:ascii="Calibri" w:eastAsia="Calibri" w:hAnsi="Calibri" w:cs="Calibri"/>
-            <w:color w:val="2F5D62"/>
-            <w:sz w:val="19"/>
-            <w:szCs w:val="19"/>
-            <w:u w:val="single"/>
-          </w:rPr>
-          <w:t>folio</w:t>
+          <w:t>Portfolio</w:t>
         </w:r>
       </w:hyperlink>
       <w:r>
@@ -648,7 +628,62 @@
           <w:sz w:val="19"/>
           <w:szCs w:val="19"/>
         </w:rPr>
-        <w:t>Colorado State University  ·  Project: Neural Correlates of Prospective Memory</w:t>
+        <w:t xml:space="preserve">Colorado State University  ·  </w:t>
+      </w:r>
+      <w:r>
+        <w:rPr>
+          <w:rFonts w:ascii="Calibri" w:eastAsia="Calibri" w:hAnsi="Calibri" w:cs="Calibri"/>
+          <w:i/>
+          <w:iCs/>
+          <w:color w:val="5B5B5B"/>
+          <w:sz w:val="19"/>
+          <w:szCs w:val="19"/>
+        </w:rPr>
+        <w:t xml:space="preserve">PI: Dr. </w:t>
+      </w:r>
+      <w:r>
+        <w:rPr>
+          <w:rFonts w:ascii="Calibri" w:eastAsia="Calibri" w:hAnsi="Calibri" w:cs="Calibri"/>
+          <w:i/>
+          <w:iCs/>
+          <w:color w:val="5B5B5B"/>
+          <w:sz w:val="19"/>
+          <w:szCs w:val="19"/>
+        </w:rPr>
+        <w:t xml:space="preserve">Deana Davalos </w:t>
+      </w:r>
+      <w:r>
+        <w:rPr>
+          <w:rFonts w:ascii="Calibri" w:eastAsia="Calibri" w:hAnsi="Calibri" w:cs="Calibri"/>
+          <w:i/>
+          <w:iCs/>
+          <w:color w:val="5B5B5B"/>
+          <w:sz w:val="19"/>
+          <w:szCs w:val="19"/>
+        </w:rPr>
+        <w:t xml:space="preserve">· </w:t>
+      </w:r>
+      <w:r>
+        <w:rPr>
+          <w:rFonts w:ascii="Calibri" w:eastAsia="Calibri" w:hAnsi="Calibri" w:cs="Calibri"/>
+          <w:i/>
+          <w:iCs/>
+          <w:color w:val="5B5B5B"/>
+          <w:sz w:val="19"/>
+          <w:szCs w:val="19"/>
+        </w:rPr>
+        <w:t xml:space="preserve"> </w:t>
+      </w:r>
+      <w:r>
+        <w:rPr>
+          <w:rFonts w:ascii="Calibri" w:eastAsia="Calibri" w:hAnsi="Calibri" w:cs="Calibri"/>
+          <w:i/>
+          <w:iCs/>
+          <w:color w:val="5B5B5B"/>
+          <w:sz w:val="19"/>
+          <w:szCs w:val="19"/>
+        </w:rPr>
+        <w:t>Project: Neural Correlates of Prospective Memory</w:t>
       </w:r>
     </w:p>
     <w:p>
@@ -727,7 +762,51 @@
           <w:sz w:val="19"/>
           <w:szCs w:val="19"/>
         </w:rPr>
-        <w:t>Colorado State University  ·  Projects: FIPRED, AR Cueing in Visual Search, Germane Load</w:t>
+        <w:t xml:space="preserve">Colorado State University  </w:t>
+      </w:r>
+      <w:r>
+        <w:rPr>
+          <w:rFonts w:ascii="Calibri" w:eastAsia="Calibri" w:hAnsi="Calibri" w:cs="Calibri"/>
+          <w:i/>
+          <w:iCs/>
+          <w:color w:val="5B5B5B"/>
+          <w:sz w:val="19"/>
+          <w:szCs w:val="19"/>
+        </w:rPr>
+        <w:t xml:space="preserve">·  PI: Dr. </w:t>
+      </w:r>
+      <w:r>
+        <w:rPr>
+          <w:rFonts w:ascii="Calibri" w:eastAsia="Calibri" w:hAnsi="Calibri" w:cs="Calibri"/>
+          <w:i/>
+          <w:iCs/>
+          <w:color w:val="5B5B5B"/>
+          <w:sz w:val="19"/>
+          <w:szCs w:val="19"/>
+        </w:rPr>
+        <w:t>Chris Wickens</w:t>
+      </w:r>
+      <w:r>
+        <w:rPr>
+          <w:rFonts w:ascii="Calibri" w:eastAsia="Calibri" w:hAnsi="Calibri" w:cs="Calibri"/>
+          <w:i/>
+          <w:iCs/>
+          <w:color w:val="5B5B5B"/>
+          <w:sz w:val="19"/>
+          <w:szCs w:val="19"/>
+        </w:rPr>
+        <w:t xml:space="preserve"> ·  </w:t>
+      </w:r>
+      <w:r>
+        <w:rPr>
+          <w:rFonts w:ascii="Calibri" w:eastAsia="Calibri" w:hAnsi="Calibri" w:cs="Calibri"/>
+          <w:i/>
+          <w:iCs/>
+          <w:color w:val="5B5B5B"/>
+          <w:sz w:val="19"/>
+          <w:szCs w:val="19"/>
+        </w:rPr>
+        <w:t>Projects: FIPRED, AR Cueing in Visual Search, Germane Load</w:t>
       </w:r>
     </w:p>
     <w:p>

</xml_diff>